<commit_message>
Events screen laid out as in the course sketch; add course sample files and test
Co-authored-by: Cursor <cursoragent@cursor.com>
</commit_message>
<xml_diff>
--- a/readme.docx
+++ b/readme.docx
@@ -21,7 +21,7 @@
     <w:p>
       <w:pPr>
         <w:shd w:val="clear" w:color="auto" w:fill="E2EFDA"/>
-        <w:divId w:val="200440911"/>
+        <w:divId w:val="1587685796"/>
         <w:rPr>
           <w:rFonts w:ascii="Calibri" w:eastAsia="Times New Roman" w:hAnsi="Calibri" w:cs="Calibri"/>
           <w:sz w:val="22"/>
@@ -932,7 +932,21 @@
                 <w:sz w:val="20"/>
                 <w:szCs w:val="20"/>
               </w:rPr>
-              <w:t>Example EX3 XML files (valid files and files with errors) and the EX3 schema.</w:t>
+              <w:t>The course sample files and schema (</w:t>
+            </w:r>
+            <w:r>
+              <w:rPr>
+                <w:rStyle w:val="HTMLCode"/>
+              </w:rPr>
+              <w:t>samples\course</w:t>
+            </w:r>
+            <w:r>
+              <w:rPr>
+                <w:rFonts w:ascii="Calibri" w:eastAsia="Times New Roman" w:hAnsi="Calibri" w:cs="Calibri"/>
+                <w:sz w:val="20"/>
+                <w:szCs w:val="20"/>
+              </w:rPr>
+              <w:t>) and our own example files (valid files and files with errors).</w:t>
             </w:r>
           </w:p>
         </w:tc>
@@ -1148,16 +1162,16 @@
           <w:szCs w:val="22"/>
           <w:lang w:val="en"/>
         </w:rPr>
-        <w:t xml:space="preserve">A user is "online" while the client keeps polling (last request less than 6 seconds ago). After Logout, closing the </w:t>
-      </w:r>
-      <w:r>
-        <w:rPr>
-          <w:rFonts w:ascii="Calibri" w:eastAsia="Times New Roman" w:hAnsi="Calibri" w:cs="Calibri"/>
-          <w:sz w:val="22"/>
-          <w:szCs w:val="22"/>
-          <w:lang w:val="en"/>
-        </w:rPr>
-        <w:t xml:space="preserve">window or 6 seconds without requests, the same name can log in again and </w:t>
+        <w:t xml:space="preserve">A user is "online" </w:t>
+      </w:r>
+      <w:r>
+        <w:rPr>
+          <w:rFonts w:ascii="Calibri" w:eastAsia="Times New Roman" w:hAnsi="Calibri" w:cs="Calibri"/>
+          <w:sz w:val="22"/>
+          <w:szCs w:val="22"/>
+          <w:lang w:val="en"/>
+        </w:rPr>
+        <w:t xml:space="preserve">while the client keeps polling (last request less than 6 seconds ago). After Logout, closing the window or 6 seconds without requests, the same name can log in again and </w:t>
       </w:r>
       <w:r>
         <w:rPr>
@@ -1671,16 +1685,7 @@
           <w:szCs w:val="22"/>
           <w:lang w:val="en"/>
         </w:rPr>
-        <w:t xml:space="preserve"> </w:t>
-      </w:r>
-      <w:r>
-        <w:rPr>
-          <w:rFonts w:ascii="Calibri" w:eastAsia="Times New Roman" w:hAnsi="Calibri" w:cs="Calibri"/>
-          <w:sz w:val="22"/>
-          <w:szCs w:val="22"/>
-          <w:lang w:val="en"/>
-        </w:rPr>
-        <w:t xml:space="preserve">(computed with log-sum-exp for stability), price of option </w:t>
+        <w:t xml:space="preserve"> (computed with log-sum-exp for stability), price of option </w:t>
       </w:r>
       <w:r>
         <w:rPr>
@@ -1996,7 +2001,6 @@
           <w:rFonts w:ascii="Calibri" w:eastAsia="Times New Roman" w:hAnsi="Calibri" w:cs="Calibri"/>
           <w:lang w:val="en"/>
         </w:rPr>
-        <w:lastRenderedPageBreak/>
         <w:t>Client</w:t>
       </w:r>
     </w:p>
@@ -2021,6 +2025,7 @@
           <w:szCs w:val="22"/>
           <w:lang w:val="en"/>
         </w:rPr>
+        <w:lastRenderedPageBreak/>
         <w:t xml:space="preserve">HTTP is done with the JDK </w:t>
       </w:r>
       <w:r>
@@ -2192,7 +2197,16 @@
           <w:szCs w:val="22"/>
           <w:lang w:val="en"/>
         </w:rPr>
-        <w:t xml:space="preserve"> – user name only; errors (name taken, server not running) are shown on the same screen.</w:t>
+        <w:t xml:space="preserve"> – </w:t>
+      </w:r>
+      <w:r>
+        <w:rPr>
+          <w:rFonts w:ascii="Calibri" w:eastAsia="Times New Roman" w:hAnsi="Calibri" w:cs="Calibri"/>
+          <w:sz w:val="22"/>
+          <w:szCs w:val="22"/>
+          <w:lang w:val="en"/>
+        </w:rPr>
+        <w:t>user name only; errors (name taken, server not running) are shown on the same screen.</w:t>
       </w:r>
     </w:p>
     <w:p>
@@ -2227,7 +2241,7 @@
           <w:szCs w:val="22"/>
           <w:lang w:val="en"/>
         </w:rPr>
-        <w:t xml:space="preserve"> – all events in the system with filters (type, status, commission, "only my MM events"), details of the selected event (prices, order books, history, participants) and the actions Open / Close (for the market maker) and Participate / Trade. "Load events XML" is in the top bar.</w:t>
+        <w:t xml:space="preserve"> – laid out as in the course sketch. On the left: the filter line (method, status, commission, "only my MM events") and all events in the system. On the right, "Event details and trade": the event's details, the actions Participate / Trade, Open and Close (the last two for the market maker only), one box per option (its order book with bids and asks for order-book events, or its LMSR price), and the participations information and trade history. "Load events XML" is in the top bar.</w:t>
       </w:r>
     </w:p>
     <w:p>
@@ -2373,16 +2387,7 @@
           <w:szCs w:val="22"/>
           <w:lang w:val="en"/>
         </w:rPr>
-        <w:t xml:space="preserve"> (JSON objects </w:t>
-      </w:r>
-      <w:r>
-        <w:rPr>
-          <w:rFonts w:ascii="Calibri" w:hAnsi="Calibri" w:cs="Calibri"/>
-          <w:sz w:val="22"/>
-          <w:szCs w:val="22"/>
-          <w:lang w:val="en"/>
-        </w:rPr>
-        <w:t xml:space="preserve">shared by server and client), </w:t>
+        <w:t xml:space="preserve"> (JSON objects shared by server and client), </w:t>
       </w:r>
       <w:r>
         <w:rPr>
@@ -2402,7 +2407,16 @@
           <w:szCs w:val="22"/>
           <w:lang w:val="en"/>
         </w:rPr>
-        <w:t xml:space="preserve"> (servlets, packed into the WAR) and </w:t>
+        <w:t xml:space="preserve"> </w:t>
+      </w:r>
+      <w:r>
+        <w:rPr>
+          <w:rFonts w:ascii="Calibri" w:hAnsi="Calibri" w:cs="Calibri"/>
+          <w:sz w:val="22"/>
+          <w:szCs w:val="22"/>
+          <w:lang w:val="en"/>
+        </w:rPr>
+        <w:t xml:space="preserve">(servlets, packed into the WAR) and </w:t>
       </w:r>
       <w:r>
         <w:rPr>
@@ -2915,6 +2929,7 @@
               <w:rPr>
                 <w:rStyle w:val="HTMLCode"/>
               </w:rPr>
+              <w:lastRenderedPageBreak/>
               <w:t>LedgerEntry</w:t>
             </w:r>
           </w:p>
@@ -4668,6 +4683,7 @@
               <w:rPr>
                 <w:rStyle w:val="HTMLCode"/>
               </w:rPr>
+              <w:lastRenderedPageBreak/>
               <w:t>/event?id=</w:t>
             </w:r>
           </w:p>
@@ -5464,8 +5480,8 @@
         <w:tblLook w:val="04A0" w:firstRow="1" w:lastRow="0" w:firstColumn="1" w:lastColumn="0" w:noHBand="0" w:noVBand="1"/>
       </w:tblPr>
       <w:tblGrid>
-        <w:gridCol w:w="3461"/>
-        <w:gridCol w:w="6269"/>
+        <w:gridCol w:w="3355"/>
+        <w:gridCol w:w="6375"/>
       </w:tblGrid>
       <w:tr>
         <w:tc>
@@ -5920,7 +5936,79 @@
                 <w:sz w:val="20"/>
                 <w:szCs w:val="20"/>
               </w:rPr>
-              <w:t>Events screen (reuses EX2 filters, table, details and actions).</w:t>
+              <w:t>Events screen: filter line and events table (reused from EX2) next to the details panel.</w:t>
+            </w:r>
+          </w:p>
+        </w:tc>
+      </w:tr>
+      <w:tr>
+        <w:tc>
+          <w:tcPr>
+            <w:tcW w:w="0" w:type="auto"/>
+            <w:tcBorders>
+              <w:top w:val="single" w:sz="6" w:space="0" w:color="A6A6A6"/>
+              <w:left w:val="single" w:sz="6" w:space="0" w:color="A6A6A6"/>
+              <w:bottom w:val="single" w:sz="6" w:space="0" w:color="A6A6A6"/>
+              <w:right w:val="single" w:sz="6" w:space="0" w:color="A6A6A6"/>
+            </w:tcBorders>
+            <w:tcMar>
+              <w:top w:w="60" w:type="dxa"/>
+              <w:left w:w="120" w:type="dxa"/>
+              <w:bottom w:w="60" w:type="dxa"/>
+              <w:right w:w="120" w:type="dxa"/>
+            </w:tcMar>
+            <w:hideMark/>
+          </w:tcPr>
+          <w:p>
+            <w:pPr>
+              <w:spacing w:before="80" w:after="160"/>
+              <w:rPr>
+                <w:rFonts w:ascii="Calibri" w:eastAsia="Times New Roman" w:hAnsi="Calibri" w:cs="Calibri"/>
+                <w:sz w:val="20"/>
+                <w:szCs w:val="20"/>
+              </w:rPr>
+            </w:pPr>
+            <w:r>
+              <w:rPr>
+                <w:rStyle w:val="HTMLCode"/>
+              </w:rPr>
+              <w:t>ui.EventDetailsView</w:t>
+            </w:r>
+          </w:p>
+        </w:tc>
+        <w:tc>
+          <w:tcPr>
+            <w:tcW w:w="0" w:type="auto"/>
+            <w:tcBorders>
+              <w:top w:val="single" w:sz="6" w:space="0" w:color="A6A6A6"/>
+              <w:left w:val="single" w:sz="6" w:space="0" w:color="A6A6A6"/>
+              <w:bottom w:val="single" w:sz="6" w:space="0" w:color="A6A6A6"/>
+              <w:right w:val="single" w:sz="6" w:space="0" w:color="A6A6A6"/>
+            </w:tcBorders>
+            <w:tcMar>
+              <w:top w:w="60" w:type="dxa"/>
+              <w:left w:w="120" w:type="dxa"/>
+              <w:bottom w:w="60" w:type="dxa"/>
+              <w:right w:w="120" w:type="dxa"/>
+            </w:tcMar>
+            <w:hideMark/>
+          </w:tcPr>
+          <w:p>
+            <w:pPr>
+              <w:spacing w:before="80" w:after="160"/>
+              <w:rPr>
+                <w:rFonts w:ascii="Calibri" w:eastAsia="Times New Roman" w:hAnsi="Calibri" w:cs="Calibri"/>
+                <w:sz w:val="20"/>
+                <w:szCs w:val="20"/>
+              </w:rPr>
+            </w:pPr>
+            <w:r>
+              <w:rPr>
+                <w:rFonts w:ascii="Calibri" w:eastAsia="Times New Roman" w:hAnsi="Calibri" w:cs="Calibri"/>
+                <w:sz w:val="20"/>
+                <w:szCs w:val="20"/>
+              </w:rPr>
+              <w:t>"Event details and trade" panel: event details, actions, a box per option with its order book or LMSR price, participations and trade history.</w:t>
             </w:r>
           </w:p>
         </w:tc>
@@ -6255,6 +6343,7 @@
           <w:rFonts w:ascii="Calibri" w:eastAsia="Times New Roman" w:hAnsi="Calibri" w:cs="Calibri"/>
           <w:lang w:val="en"/>
         </w:rPr>
+        <w:lastRenderedPageBreak/>
         <w:t>Sample files</w:t>
       </w:r>
     </w:p>
@@ -6270,8 +6359,8 @@
         <w:tblLook w:val="04A0" w:firstRow="1" w:lastRow="0" w:firstColumn="1" w:lastColumn="0" w:noHBand="0" w:noVBand="1"/>
       </w:tblPr>
       <w:tblGrid>
-        <w:gridCol w:w="3125"/>
-        <w:gridCol w:w="6605"/>
+        <w:gridCol w:w="3009"/>
+        <w:gridCol w:w="6721"/>
       </w:tblGrid>
       <w:tr>
         <w:tc>
@@ -6353,6 +6442,150 @@
                 <w:szCs w:val="20"/>
               </w:rPr>
               <w:t>Expected result</w:t>
+            </w:r>
+          </w:p>
+        </w:tc>
+      </w:tr>
+      <w:tr>
+        <w:tc>
+          <w:tcPr>
+            <w:tcW w:w="0" w:type="auto"/>
+            <w:tcBorders>
+              <w:top w:val="single" w:sz="6" w:space="0" w:color="A6A6A6"/>
+              <w:left w:val="single" w:sz="6" w:space="0" w:color="A6A6A6"/>
+              <w:bottom w:val="single" w:sz="6" w:space="0" w:color="A6A6A6"/>
+              <w:right w:val="single" w:sz="6" w:space="0" w:color="A6A6A6"/>
+            </w:tcBorders>
+            <w:tcMar>
+              <w:top w:w="60" w:type="dxa"/>
+              <w:left w:w="120" w:type="dxa"/>
+              <w:bottom w:w="60" w:type="dxa"/>
+              <w:right w:w="120" w:type="dxa"/>
+            </w:tcMar>
+            <w:hideMark/>
+          </w:tcPr>
+          <w:p>
+            <w:pPr>
+              <w:spacing w:before="80" w:after="160"/>
+              <w:rPr>
+                <w:rFonts w:ascii="Calibri" w:eastAsia="Times New Roman" w:hAnsi="Calibri" w:cs="Calibri"/>
+                <w:sz w:val="20"/>
+                <w:szCs w:val="20"/>
+              </w:rPr>
+            </w:pPr>
+            <w:r>
+              <w:rPr>
+                <w:rStyle w:val="HTMLCode"/>
+              </w:rPr>
+              <w:t>course\ex3-course-three-events.xml</w:t>
+            </w:r>
+          </w:p>
+        </w:tc>
+        <w:tc>
+          <w:tcPr>
+            <w:tcW w:w="0" w:type="auto"/>
+            <w:tcBorders>
+              <w:top w:val="single" w:sz="6" w:space="0" w:color="A6A6A6"/>
+              <w:left w:val="single" w:sz="6" w:space="0" w:color="A6A6A6"/>
+              <w:bottom w:val="single" w:sz="6" w:space="0" w:color="A6A6A6"/>
+              <w:right w:val="single" w:sz="6" w:space="0" w:color="A6A6A6"/>
+            </w:tcBorders>
+            <w:tcMar>
+              <w:top w:w="60" w:type="dxa"/>
+              <w:left w:w="120" w:type="dxa"/>
+              <w:bottom w:w="60" w:type="dxa"/>
+              <w:right w:w="120" w:type="dxa"/>
+            </w:tcMar>
+            <w:hideMark/>
+          </w:tcPr>
+          <w:p>
+            <w:pPr>
+              <w:spacing w:before="80" w:after="160"/>
+              <w:rPr>
+                <w:rFonts w:ascii="Calibri" w:eastAsia="Times New Roman" w:hAnsi="Calibri" w:cs="Calibri"/>
+                <w:sz w:val="20"/>
+                <w:szCs w:val="20"/>
+              </w:rPr>
+            </w:pPr>
+            <w:r>
+              <w:rPr>
+                <w:rFonts w:ascii="Calibri" w:eastAsia="Times New Roman" w:hAnsi="Calibri" w:cs="Calibri"/>
+                <w:sz w:val="20"/>
+                <w:szCs w:val="20"/>
+              </w:rPr>
+              <w:t>Course file: loads 3 events (2 order-book, 1 LMSR). Loading it a second time is rejected because the names already exist.</w:t>
+            </w:r>
+          </w:p>
+        </w:tc>
+      </w:tr>
+      <w:tr>
+        <w:tc>
+          <w:tcPr>
+            <w:tcW w:w="0" w:type="auto"/>
+            <w:tcBorders>
+              <w:top w:val="single" w:sz="6" w:space="0" w:color="A6A6A6"/>
+              <w:left w:val="single" w:sz="6" w:space="0" w:color="A6A6A6"/>
+              <w:bottom w:val="single" w:sz="6" w:space="0" w:color="A6A6A6"/>
+              <w:right w:val="single" w:sz="6" w:space="0" w:color="A6A6A6"/>
+            </w:tcBorders>
+            <w:tcMar>
+              <w:top w:w="60" w:type="dxa"/>
+              <w:left w:w="120" w:type="dxa"/>
+              <w:bottom w:w="60" w:type="dxa"/>
+              <w:right w:w="120" w:type="dxa"/>
+            </w:tcMar>
+            <w:hideMark/>
+          </w:tcPr>
+          <w:p>
+            <w:pPr>
+              <w:spacing w:before="80" w:after="160"/>
+              <w:rPr>
+                <w:rFonts w:ascii="Calibri" w:eastAsia="Times New Roman" w:hAnsi="Calibri" w:cs="Calibri"/>
+                <w:sz w:val="20"/>
+                <w:szCs w:val="20"/>
+              </w:rPr>
+            </w:pPr>
+            <w:r>
+              <w:rPr>
+                <w:rStyle w:val="HTMLCode"/>
+              </w:rPr>
+              <w:t>course\ex3-course-mujtaba.xml</w:t>
+            </w:r>
+          </w:p>
+        </w:tc>
+        <w:tc>
+          <w:tcPr>
+            <w:tcW w:w="0" w:type="auto"/>
+            <w:tcBorders>
+              <w:top w:val="single" w:sz="6" w:space="0" w:color="A6A6A6"/>
+              <w:left w:val="single" w:sz="6" w:space="0" w:color="A6A6A6"/>
+              <w:bottom w:val="single" w:sz="6" w:space="0" w:color="A6A6A6"/>
+              <w:right w:val="single" w:sz="6" w:space="0" w:color="A6A6A6"/>
+            </w:tcBorders>
+            <w:tcMar>
+              <w:top w:w="60" w:type="dxa"/>
+              <w:left w:w="120" w:type="dxa"/>
+              <w:bottom w:w="60" w:type="dxa"/>
+              <w:right w:w="120" w:type="dxa"/>
+            </w:tcMar>
+            <w:hideMark/>
+          </w:tcPr>
+          <w:p>
+            <w:pPr>
+              <w:spacing w:before="80" w:after="160"/>
+              <w:rPr>
+                <w:rFonts w:ascii="Calibri" w:eastAsia="Times New Roman" w:hAnsi="Calibri" w:cs="Calibri"/>
+                <w:sz w:val="20"/>
+                <w:szCs w:val="20"/>
+              </w:rPr>
+            </w:pPr>
+            <w:r>
+              <w:rPr>
+                <w:rFonts w:ascii="Calibri" w:eastAsia="Times New Roman" w:hAnsi="Calibri" w:cs="Calibri"/>
+                <w:sz w:val="20"/>
+                <w:szCs w:val="20"/>
+              </w:rPr>
+              <w:t>Course file: loads 1 LMSR event; the events of both files accumulate.</w:t>
             </w:r>
           </w:p>
         </w:tc>
@@ -6824,9 +7057,9 @@
 <file path=word/numbering.xml><?xml version="1.0" encoding="utf-8"?>
 <w:numbering xmlns:wpc="http://schemas.microsoft.com/office/word/2010/wordprocessingCanvas" xmlns:cx="http://schemas.microsoft.com/office/drawing/2014/chartex" xmlns:cx1="http://schemas.microsoft.com/office/drawing/2015/9/8/chartex" xmlns:cx2="http://schemas.microsoft.com/office/drawing/2015/10/21/chartex" xmlns:cx3="http://schemas.microsoft.com/office/drawing/2016/5/9/chartex" xmlns:cx4="http://schemas.microsoft.com/office/drawing/2016/5/10/chartex" xmlns:cx5="http://schemas.microsoft.com/office/drawing/2016/5/11/chartex" xmlns:cx6="http://schemas.microsoft.com/office/drawing/2016/5/12/chartex" xmlns:cx7="http://schemas.microsoft.com/office/drawing/2016/5/13/chartex" xmlns:cx8="http://schemas.microsoft.com/office/drawing/2016/5/14/chartex" xmlns:mc="http://schemas.openxmlformats.org/markup-compatibility/2006" xmlns:aink="http://schemas.microsoft.com/office/drawing/2016/ink" xmlns:am3d="http://schemas.microsoft.com/office/drawing/2017/model3d" xmlns:o="urn:schemas-microsoft-com:office:office" xmlns:oel="http://schemas.microsoft.com/office/2019/extlst" xmlns:r="http://schemas.openxmlformats.org/officeDocument/2006/relationships" xmlns:m="http://schemas.openxmlformats.org/officeDocument/2006/math" xmlns:v="urn:schemas-microsoft-com:vml" xmlns:wp14="http://schemas.microsoft.com/office/word/2010/wordprocessingDrawing" xmlns:wp="http://schemas.openxmlformats.org/drawingml/2006/wordprocessingDrawing" xmlns:w10="urn:schemas-microsoft-com:office:word" xmlns:w="http://schemas.openxmlformats.org/wordprocessingml/2006/main" xmlns:w14="http://schemas.microsoft.com/office/word/2010/wordml" xmlns:w15="http://schemas.microsoft.com/office/word/2012/wordml" xmlns:w16cex="http://schemas.microsoft.com/office/word/2018/wordml/cex" xmlns:w16cid="http://schemas.microsoft.com/office/word/2016/wordml/cid" xmlns:w16="http://schemas.microsoft.com/office/word/2018/wordml" xmlns:w16du="http://schemas.microsoft.com/office/word/2023/wordml/word16du" xmlns:w16sdtdh="http://schemas.microsoft.com/office/word/2020/wordml/sdtdatahash" xmlns:w16sdtfl="http://schemas.microsoft.com/office/word/2024/wordml/sdtformatlock" xmlns:w16se="http://schemas.microsoft.com/office/word/2015/wordml/symex" xmlns:wpg="http://schemas.microsoft.com/office/word/2010/wordprocessingGroup" xmlns:wpi="http://schemas.microsoft.com/office/word/2010/wordprocessingInk" xmlns:wne="http://schemas.microsoft.com/office/word/2006/wordml" xmlns:wps="http://schemas.microsoft.com/office/word/2010/wordprocessingShape" mc:Ignorable="w14 w15 w16se w16cid w16 w16cex w16sdtdh w16sdtfl w16du wp14">
   <w:abstractNum w:abstractNumId="0" w15:restartNumberingAfterBreak="0">
-    <w:nsid w:val="054902F6"/>
+    <w:nsid w:val="25754614"/>
     <w:multiLevelType w:val="multilevel"/>
-    <w:tmpl w:val="7E3683B8"/>
+    <w:tmpl w:val="4FF254E8"/>
     <w:lvl w:ilvl="0">
       <w:start w:val="1"/>
       <w:numFmt w:val="bullet"/>
@@ -6973,9 +7206,158 @@
     </w:lvl>
   </w:abstractNum>
   <w:abstractNum w:abstractNumId="1" w15:restartNumberingAfterBreak="0">
-    <w:nsid w:val="37A20BA0"/>
+    <w:nsid w:val="273F63A9"/>
     <w:multiLevelType w:val="multilevel"/>
-    <w:tmpl w:val="7780056E"/>
+    <w:tmpl w:val="38FA3242"/>
+    <w:lvl w:ilvl="0">
+      <w:start w:val="1"/>
+      <w:numFmt w:val="bullet"/>
+      <w:lvlText w:val=""/>
+      <w:lvlJc w:val="left"/>
+      <w:pPr>
+        <w:tabs>
+          <w:tab w:val="num" w:pos="720"/>
+        </w:tabs>
+        <w:ind w:left="720" w:hanging="360"/>
+      </w:pPr>
+      <w:rPr>
+        <w:rFonts w:ascii="Symbol" w:hAnsi="Symbol" w:hint="default"/>
+        <w:sz w:val="20"/>
+      </w:rPr>
+    </w:lvl>
+    <w:lvl w:ilvl="1" w:tentative="1">
+      <w:start w:val="1"/>
+      <w:numFmt w:val="bullet"/>
+      <w:lvlText w:val="o"/>
+      <w:lvlJc w:val="left"/>
+      <w:pPr>
+        <w:tabs>
+          <w:tab w:val="num" w:pos="1440"/>
+        </w:tabs>
+        <w:ind w:left="1440" w:hanging="360"/>
+      </w:pPr>
+      <w:rPr>
+        <w:rFonts w:ascii="Courier New" w:hAnsi="Courier New" w:hint="default"/>
+        <w:sz w:val="20"/>
+      </w:rPr>
+    </w:lvl>
+    <w:lvl w:ilvl="2" w:tentative="1">
+      <w:start w:val="1"/>
+      <w:numFmt w:val="bullet"/>
+      <w:lvlText w:val=""/>
+      <w:lvlJc w:val="left"/>
+      <w:pPr>
+        <w:tabs>
+          <w:tab w:val="num" w:pos="2160"/>
+        </w:tabs>
+        <w:ind w:left="2160" w:hanging="360"/>
+      </w:pPr>
+      <w:rPr>
+        <w:rFonts w:ascii="Wingdings" w:hAnsi="Wingdings" w:hint="default"/>
+        <w:sz w:val="20"/>
+      </w:rPr>
+    </w:lvl>
+    <w:lvl w:ilvl="3" w:tentative="1">
+      <w:start w:val="1"/>
+      <w:numFmt w:val="bullet"/>
+      <w:lvlText w:val=""/>
+      <w:lvlJc w:val="left"/>
+      <w:pPr>
+        <w:tabs>
+          <w:tab w:val="num" w:pos="2880"/>
+        </w:tabs>
+        <w:ind w:left="2880" w:hanging="360"/>
+      </w:pPr>
+      <w:rPr>
+        <w:rFonts w:ascii="Wingdings" w:hAnsi="Wingdings" w:hint="default"/>
+        <w:sz w:val="20"/>
+      </w:rPr>
+    </w:lvl>
+    <w:lvl w:ilvl="4" w:tentative="1">
+      <w:start w:val="1"/>
+      <w:numFmt w:val="bullet"/>
+      <w:lvlText w:val=""/>
+      <w:lvlJc w:val="left"/>
+      <w:pPr>
+        <w:tabs>
+          <w:tab w:val="num" w:pos="3600"/>
+        </w:tabs>
+        <w:ind w:left="3600" w:hanging="360"/>
+      </w:pPr>
+      <w:rPr>
+        <w:rFonts w:ascii="Wingdings" w:hAnsi="Wingdings" w:hint="default"/>
+        <w:sz w:val="20"/>
+      </w:rPr>
+    </w:lvl>
+    <w:lvl w:ilvl="5" w:tentative="1">
+      <w:start w:val="1"/>
+      <w:numFmt w:val="bullet"/>
+      <w:lvlText w:val=""/>
+      <w:lvlJc w:val="left"/>
+      <w:pPr>
+        <w:tabs>
+          <w:tab w:val="num" w:pos="4320"/>
+        </w:tabs>
+        <w:ind w:left="4320" w:hanging="360"/>
+      </w:pPr>
+      <w:rPr>
+        <w:rFonts w:ascii="Wingdings" w:hAnsi="Wingdings" w:hint="default"/>
+        <w:sz w:val="20"/>
+      </w:rPr>
+    </w:lvl>
+    <w:lvl w:ilvl="6" w:tentative="1">
+      <w:start w:val="1"/>
+      <w:numFmt w:val="bullet"/>
+      <w:lvlText w:val=""/>
+      <w:lvlJc w:val="left"/>
+      <w:pPr>
+        <w:tabs>
+          <w:tab w:val="num" w:pos="5040"/>
+        </w:tabs>
+        <w:ind w:left="5040" w:hanging="360"/>
+      </w:pPr>
+      <w:rPr>
+        <w:rFonts w:ascii="Wingdings" w:hAnsi="Wingdings" w:hint="default"/>
+        <w:sz w:val="20"/>
+      </w:rPr>
+    </w:lvl>
+    <w:lvl w:ilvl="7" w:tentative="1">
+      <w:start w:val="1"/>
+      <w:numFmt w:val="bullet"/>
+      <w:lvlText w:val=""/>
+      <w:lvlJc w:val="left"/>
+      <w:pPr>
+        <w:tabs>
+          <w:tab w:val="num" w:pos="5760"/>
+        </w:tabs>
+        <w:ind w:left="5760" w:hanging="360"/>
+      </w:pPr>
+      <w:rPr>
+        <w:rFonts w:ascii="Wingdings" w:hAnsi="Wingdings" w:hint="default"/>
+        <w:sz w:val="20"/>
+      </w:rPr>
+    </w:lvl>
+    <w:lvl w:ilvl="8" w:tentative="1">
+      <w:start w:val="1"/>
+      <w:numFmt w:val="bullet"/>
+      <w:lvlText w:val=""/>
+      <w:lvlJc w:val="left"/>
+      <w:pPr>
+        <w:tabs>
+          <w:tab w:val="num" w:pos="6480"/>
+        </w:tabs>
+        <w:ind w:left="6480" w:hanging="360"/>
+      </w:pPr>
+      <w:rPr>
+        <w:rFonts w:ascii="Wingdings" w:hAnsi="Wingdings" w:hint="default"/>
+        <w:sz w:val="20"/>
+      </w:rPr>
+    </w:lvl>
+  </w:abstractNum>
+  <w:abstractNum w:abstractNumId="2" w15:restartNumberingAfterBreak="0">
+    <w:nsid w:val="28DC45C2"/>
+    <w:multiLevelType w:val="multilevel"/>
+    <w:tmpl w:val="B5AAAB5C"/>
     <w:lvl w:ilvl="0">
       <w:start w:val="1"/>
       <w:numFmt w:val="bullet"/>
@@ -7121,10 +7503,10 @@
       </w:rPr>
     </w:lvl>
   </w:abstractNum>
-  <w:abstractNum w:abstractNumId="2" w15:restartNumberingAfterBreak="0">
-    <w:nsid w:val="5938740E"/>
+  <w:abstractNum w:abstractNumId="3" w15:restartNumberingAfterBreak="0">
+    <w:nsid w:val="5DE90080"/>
     <w:multiLevelType w:val="multilevel"/>
-    <w:tmpl w:val="B5D08E64"/>
+    <w:tmpl w:val="B336B0CA"/>
     <w:lvl w:ilvl="0">
       <w:start w:val="1"/>
       <w:numFmt w:val="bullet"/>
@@ -7270,10 +7652,10 @@
       </w:rPr>
     </w:lvl>
   </w:abstractNum>
-  <w:abstractNum w:abstractNumId="3" w15:restartNumberingAfterBreak="0">
-    <w:nsid w:val="63590ACB"/>
+  <w:abstractNum w:abstractNumId="4" w15:restartNumberingAfterBreak="0">
+    <w:nsid w:val="7DDA7886"/>
     <w:multiLevelType w:val="multilevel"/>
-    <w:tmpl w:val="9C20FBDA"/>
+    <w:tmpl w:val="199615EE"/>
     <w:lvl w:ilvl="0">
       <w:start w:val="1"/>
       <w:numFmt w:val="bullet"/>
@@ -7419,169 +7801,20 @@
       </w:rPr>
     </w:lvl>
   </w:abstractNum>
-  <w:abstractNum w:abstractNumId="4" w15:restartNumberingAfterBreak="0">
-    <w:nsid w:val="6BDB712D"/>
-    <w:multiLevelType w:val="multilevel"/>
-    <w:tmpl w:val="4308EAB0"/>
-    <w:lvl w:ilvl="0">
-      <w:start w:val="1"/>
-      <w:numFmt w:val="bullet"/>
-      <w:lvlText w:val=""/>
-      <w:lvlJc w:val="left"/>
-      <w:pPr>
-        <w:tabs>
-          <w:tab w:val="num" w:pos="720"/>
-        </w:tabs>
-        <w:ind w:left="720" w:hanging="360"/>
-      </w:pPr>
-      <w:rPr>
-        <w:rFonts w:ascii="Symbol" w:hAnsi="Symbol" w:hint="default"/>
-        <w:sz w:val="20"/>
-      </w:rPr>
-    </w:lvl>
-    <w:lvl w:ilvl="1" w:tentative="1">
-      <w:start w:val="1"/>
-      <w:numFmt w:val="bullet"/>
-      <w:lvlText w:val="o"/>
-      <w:lvlJc w:val="left"/>
-      <w:pPr>
-        <w:tabs>
-          <w:tab w:val="num" w:pos="1440"/>
-        </w:tabs>
-        <w:ind w:left="1440" w:hanging="360"/>
-      </w:pPr>
-      <w:rPr>
-        <w:rFonts w:ascii="Courier New" w:hAnsi="Courier New" w:hint="default"/>
-        <w:sz w:val="20"/>
-      </w:rPr>
-    </w:lvl>
-    <w:lvl w:ilvl="2" w:tentative="1">
-      <w:start w:val="1"/>
-      <w:numFmt w:val="bullet"/>
-      <w:lvlText w:val=""/>
-      <w:lvlJc w:val="left"/>
-      <w:pPr>
-        <w:tabs>
-          <w:tab w:val="num" w:pos="2160"/>
-        </w:tabs>
-        <w:ind w:left="2160" w:hanging="360"/>
-      </w:pPr>
-      <w:rPr>
-        <w:rFonts w:ascii="Wingdings" w:hAnsi="Wingdings" w:hint="default"/>
-        <w:sz w:val="20"/>
-      </w:rPr>
-    </w:lvl>
-    <w:lvl w:ilvl="3" w:tentative="1">
-      <w:start w:val="1"/>
-      <w:numFmt w:val="bullet"/>
-      <w:lvlText w:val=""/>
-      <w:lvlJc w:val="left"/>
-      <w:pPr>
-        <w:tabs>
-          <w:tab w:val="num" w:pos="2880"/>
-        </w:tabs>
-        <w:ind w:left="2880" w:hanging="360"/>
-      </w:pPr>
-      <w:rPr>
-        <w:rFonts w:ascii="Wingdings" w:hAnsi="Wingdings" w:hint="default"/>
-        <w:sz w:val="20"/>
-      </w:rPr>
-    </w:lvl>
-    <w:lvl w:ilvl="4" w:tentative="1">
-      <w:start w:val="1"/>
-      <w:numFmt w:val="bullet"/>
-      <w:lvlText w:val=""/>
-      <w:lvlJc w:val="left"/>
-      <w:pPr>
-        <w:tabs>
-          <w:tab w:val="num" w:pos="3600"/>
-        </w:tabs>
-        <w:ind w:left="3600" w:hanging="360"/>
-      </w:pPr>
-      <w:rPr>
-        <w:rFonts w:ascii="Wingdings" w:hAnsi="Wingdings" w:hint="default"/>
-        <w:sz w:val="20"/>
-      </w:rPr>
-    </w:lvl>
-    <w:lvl w:ilvl="5" w:tentative="1">
-      <w:start w:val="1"/>
-      <w:numFmt w:val="bullet"/>
-      <w:lvlText w:val=""/>
-      <w:lvlJc w:val="left"/>
-      <w:pPr>
-        <w:tabs>
-          <w:tab w:val="num" w:pos="4320"/>
-        </w:tabs>
-        <w:ind w:left="4320" w:hanging="360"/>
-      </w:pPr>
-      <w:rPr>
-        <w:rFonts w:ascii="Wingdings" w:hAnsi="Wingdings" w:hint="default"/>
-        <w:sz w:val="20"/>
-      </w:rPr>
-    </w:lvl>
-    <w:lvl w:ilvl="6" w:tentative="1">
-      <w:start w:val="1"/>
-      <w:numFmt w:val="bullet"/>
-      <w:lvlText w:val=""/>
-      <w:lvlJc w:val="left"/>
-      <w:pPr>
-        <w:tabs>
-          <w:tab w:val="num" w:pos="5040"/>
-        </w:tabs>
-        <w:ind w:left="5040" w:hanging="360"/>
-      </w:pPr>
-      <w:rPr>
-        <w:rFonts w:ascii="Wingdings" w:hAnsi="Wingdings" w:hint="default"/>
-        <w:sz w:val="20"/>
-      </w:rPr>
-    </w:lvl>
-    <w:lvl w:ilvl="7" w:tentative="1">
-      <w:start w:val="1"/>
-      <w:numFmt w:val="bullet"/>
-      <w:lvlText w:val=""/>
-      <w:lvlJc w:val="left"/>
-      <w:pPr>
-        <w:tabs>
-          <w:tab w:val="num" w:pos="5760"/>
-        </w:tabs>
-        <w:ind w:left="5760" w:hanging="360"/>
-      </w:pPr>
-      <w:rPr>
-        <w:rFonts w:ascii="Wingdings" w:hAnsi="Wingdings" w:hint="default"/>
-        <w:sz w:val="20"/>
-      </w:rPr>
-    </w:lvl>
-    <w:lvl w:ilvl="8" w:tentative="1">
-      <w:start w:val="1"/>
-      <w:numFmt w:val="bullet"/>
-      <w:lvlText w:val=""/>
-      <w:lvlJc w:val="left"/>
-      <w:pPr>
-        <w:tabs>
-          <w:tab w:val="num" w:pos="6480"/>
-        </w:tabs>
-        <w:ind w:left="6480" w:hanging="360"/>
-      </w:pPr>
-      <w:rPr>
-        <w:rFonts w:ascii="Wingdings" w:hAnsi="Wingdings" w:hint="default"/>
-        <w:sz w:val="20"/>
-      </w:rPr>
-    </w:lvl>
-  </w:abstractNum>
-  <w:num w:numId="1" w16cid:durableId="2057510044">
+  <w:num w:numId="1" w16cid:durableId="1537304350">
+    <w:abstractNumId w:val="4"/>
+  </w:num>
+  <w:num w:numId="2" w16cid:durableId="1291941656">
     <w:abstractNumId w:val="2"/>
   </w:num>
-  <w:num w:numId="2" w16cid:durableId="1429960964">
-    <w:abstractNumId w:val="1"/>
+  <w:num w:numId="3" w16cid:durableId="1301112460">
+    <w:abstractNumId w:val="0"/>
   </w:num>
-  <w:num w:numId="3" w16cid:durableId="54549779">
-    <w:abstractNumId w:val="4"/>
-  </w:num>
-  <w:num w:numId="4" w16cid:durableId="1011882819">
+  <w:num w:numId="4" w16cid:durableId="1593975360">
     <w:abstractNumId w:val="3"/>
   </w:num>
-  <w:num w:numId="5" w16cid:durableId="1567760711">
-    <w:abstractNumId w:val="0"/>
+  <w:num w:numId="5" w16cid:durableId="1274436089">
+    <w:abstractNumId w:val="1"/>
   </w:num>
 </w:numbering>
 </file>

</xml_diff>